<commit_message>
Sync the docs with the current project state
The competition attachments and the markdown docs were written before the
last round of agent work, so several numbers and behaviours were stale.

- tools 13 -> 14, agent unit tests 40 -> 44, test files 29 -> 30,
  assertions 291 -> 348 (per-file results table now includes e2e-reminders)
- evaluation counts made consistent with 附件4 (18 cases: 1 required + 17)
- document the new reminder scheduling rules (one reminder per tier per
  device, cross-device dedup via message records, max 2 per task per day,
  pending reminders dropped when a task is deleted)
- document that a resource can hold several original files
- document that setup seeds the bundled preset courseware, so the seeded
  PDFs can be opened on any account without a separate seed step
- 附件4 评测用例 was already accurate and is left unchanged
</commit_message>
<xml_diff>
--- a/附件2-README-浅浅知.docx
+++ b/附件2-README-浅浅知.docx
@@ -571,7 +571,7 @@
           <w:szCs w:val="28"/>
           <w:lang w:eastAsia="zh-CN"/>
         </w:rPr>
-        <w:t>数据库或知识库初始化：npm run setup —— 自动检测数据库连接，必要时建库、建表并创建管理员与两个示例账号（可重复执行）。</w:t>
+        <w:t>数据库或知识库初始化：npm run setup —— 自动检测数据库连接，必要时建库、建表、创建管理员与两个示例账号，并写入预设课件原件（机器学习两份 PDF，所有账号共用，可重复执行）。</w:t>
       </w:r>
     </w:p>
     <w:p>
@@ -796,7 +796,7 @@
           <w:sz w:val="24"/>
           <w:szCs w:val="28"/>
         </w:rPr>
-        <w:t>功能二：资料与 DDL 管理。在课程资料页点「＋ 导入资料」上传 PDF／Word／PPT／图片（也可以让浅浅把对话里的截图存成资料），抽取正文与结构化元数据；一份资料可以挂多份文件，预览里能继续追加、也能单独删除某一份，整份资料的删除按钮在顶部；从课程通知中提取截止时间并生成提醒，支持日历导出。</w:t>
+        <w:t>功能二：资料与 DDL 管理。在课程资料页点「＋ 导入资料」上传 PDF／Word／PPT／图片（也可以让浅浅把对话里的截图存成资料），抽取正文与结构化元数据；一份资料可以挂多份文件，预览里能继续追加、也能单独删除某一份，整份资料的删除按钮在顶部；从课程通知中提取截止时间并生成提醒，支持日历导出。提醒做了去重与限量：同一条提醒不会重复推送，每个任务每天最多两条，删除任务后它尚未触发的提醒会一并清理。</w:t>
       </w:r>
     </w:p>
     <w:p>
@@ -878,7 +878,7 @@
           <w:sz w:val="24"/>
           <w:szCs w:val="28"/>
         </w:rPr>
-        <w:t>单元测试：npm run test:agent —— Agent 内核纯逻辑测试（循环、工具注册表、提醒规则、任务分组、同步合并等），共 40 项。</w:t>
+        <w:t>单元测试：npm run test:agent —— Agent 内核纯逻辑测试（循环、工具注册表、提醒规则、任务分组、同步合并等），共 44 项。</w:t>
       </w:r>
     </w:p>
     <w:p>
@@ -1027,7 +1027,7 @@
           <w:sz w:val="24"/>
           <w:szCs w:val="28"/>
         </w:rPr>
-        <w:t>解决方式：① 启动数据库并核对连接串后重新执行 npm run setup；② 在 .env.local 填写模型密钥，或在应用内「设置 → 模型」填写自己的接口；③ 使用 npm run dev -- --port 3200 换端口；④ 执行 npm run db:seed:presets 课件1.pdf 课件2.pdf。</w:t>
+        <w:t>解决方式：① 启动数据库并核对连接串后重新执行 npm run setup；② 在 .env.local 填写模型密钥，或在应用内「设置 → 模型」填写自己的接口；③ 使用 npm run dev -- --port 3200 换端口；④ 预设课件原件会随 npm run setup 自动写入；若要改用自有课件，执行 npm run db:seed:presets 课件1.pdf 课件2.pdf。</w:t>
       </w:r>
     </w:p>
     <w:p>
@@ -1216,7 +1216,7 @@
           <w:szCs w:val="28"/>
           <w:lang w:eastAsia="zh-CN"/>
         </w:rPr>
-        <w:t>主要变更：完成账号体系与权限隔离、Agent 循环与 13 个工具、写操作确认机制、资料正文抽取与检索、复习计划生成、任务中心、跨设备同步与删除传播、一键部署脚本与测试套件。</w:t>
+        <w:t>主要变更：完成账号体系与权限隔离、Agent 循环与 14 个工具、写操作确认机制、资料正文抽取与检索、复习计划生成、任务中心、跨设备同步与删除传播、一键部署脚本与测试套件。</w:t>
       </w:r>
     </w:p>
     <w:p>

</xml_diff>

<commit_message>
Add a model-API note to the quick-start section
Tell users, in both the Word README and README.md, that they must fill in a
DeepSeek (or other OpenAI-compatible) API key and pick a vision model in
Settings before the chat and file-recognition features will work, and that
the one-click launcher opens the config file on first run so the key can be
filled in there.
</commit_message>
<xml_diff>
--- a/附件2-README-浅浅知.docx
+++ b/附件2-README-浅浅知.docx
@@ -616,6 +616,29 @@
           <w:lang w:eastAsia="zh-CN"/>
         </w:rPr>
         <w:t>访问入口或测试账号：http://localhost:3000 ；管理员 admin / admin123，普通用户 student1 / 123456、student2 / 123456（首次登录后请修改密码）。</w:t>
+      </w:r>
+    </w:p>
+    <w:p>
+      <w:pPr>
+        <w:pStyle w:val="16"/>
+        <w:spacing w:after="80"/>
+        <w:rPr>
+          <w:rFonts w:hint="eastAsia" w:ascii="宋体" w:hAnsi="宋体" w:eastAsia="宋体"/>
+          <w:sz w:val="28"/>
+          <w:szCs w:val="28"/>
+          <w:lang w:eastAsia="zh-CN"/>
+        </w:rPr>
+      </w:pPr>
+      <w:r>
+        <w:rPr>
+          <w:rFonts w:ascii="宋体" w:hAnsi="宋体" w:eastAsia="宋体"/>
+          <w:b w:val="0"/>
+          <w:color w:val="000000"/>
+          <w:sz w:val="24"/>
+          <w:szCs w:val="28"/>
+          <w:lang w:eastAsia="zh-CN"/>
+        </w:rPr>
+        <w:t xml:space="preserve">注意：在使用对话功能和识别文件功能前，请在设置中填写 DeepSeek 或其他大模型接口的 API 并选择视觉模型（请确保 API 与模型可用）；若使用快速方式双击「启动浅浅」，首次运行会在启动前自动打开配置文件（.env.local），可直接在其中填入 API 与模型。</w:t>
       </w:r>
     </w:p>
     <w:p>

</xml_diff>